<commit_message>
arreglado espaciado form opcion menor 14
</commit_message>
<xml_diff>
--- a/forms/docx/Opcion Menor 14.docx
+++ b/forms/docx/Opcion Menor 14.docx
@@ -35,7 +35,21 @@
         <w:rPr>
           <w:sz w:val="20"/>
         </w:rPr>
-        <w:t>, en el Consulado General  de España en Mendoza,</w:t>
+        <w:t xml:space="preserve">, en el Consulado </w:t>
+      </w:r>
+      <w:proofErr w:type="gramStart"/>
+      <w:r>
+        <w:rPr>
+          <w:sz w:val="20"/>
+        </w:rPr>
+        <w:t>General  de</w:t>
+      </w:r>
+      <w:proofErr w:type="gramEnd"/>
+      <w:r>
+        <w:rPr>
+          <w:sz w:val="20"/>
+        </w:rPr>
+        <w:t xml:space="preserve"> España en Mendoza,</w:t>
       </w:r>
     </w:p>
     <w:p>
@@ -161,25 +175,82 @@
           <w:rFonts w:ascii="Arial" w:hAnsi="Arial" w:cs="Arial"/>
           <w:sz w:val="20"/>
         </w:rPr>
-        <w:t>T&gt;</w:t>
-      </w:r>
-      <w:r>
-        <w:rPr>
-          <w:sz w:val="20"/>
-        </w:rPr>
-        <w:t xml:space="preserve"> ,  Argentina , el día</w:t>
-      </w:r>
-      <w:r>
-        <w:rPr>
-          <w:sz w:val="20"/>
-        </w:rPr>
-        <w:t xml:space="preserve"> &lt;FECHA-NAC-M/P-ESP&gt; </w:t>
-      </w:r>
-      <w:r>
-        <w:rPr>
-          <w:sz w:val="20"/>
-        </w:rPr>
-        <w:t xml:space="preserve"> de nacionalidad ESPAÑOLA, cuya identidad acredita por  DNI, con domicilio en   </w:t>
+        <w:t>T</w:t>
+      </w:r>
+      <w:proofErr w:type="gramStart"/>
+      <w:r>
+        <w:rPr>
+          <w:rFonts w:ascii="Arial" w:hAnsi="Arial" w:cs="Arial"/>
+          <w:sz w:val="20"/>
+        </w:rPr>
+        <w:t>&gt;</w:t>
+      </w:r>
+      <w:r>
+        <w:rPr>
+          <w:sz w:val="20"/>
+        </w:rPr>
+        <w:t xml:space="preserve"> ,</w:t>
+      </w:r>
+      <w:proofErr w:type="gramEnd"/>
+      <w:r>
+        <w:rPr>
+          <w:sz w:val="20"/>
+        </w:rPr>
+        <w:t xml:space="preserve">  </w:t>
+      </w:r>
+      <w:proofErr w:type="gramStart"/>
+      <w:r>
+        <w:rPr>
+          <w:sz w:val="20"/>
+        </w:rPr>
+        <w:t>Argentina ,</w:t>
+      </w:r>
+      <w:proofErr w:type="gramEnd"/>
+      <w:r>
+        <w:rPr>
+          <w:sz w:val="20"/>
+        </w:rPr>
+        <w:t xml:space="preserve"> el día</w:t>
+      </w:r>
+      <w:r>
+        <w:rPr>
+          <w:sz w:val="20"/>
+        </w:rPr>
+        <w:t xml:space="preserve"> &lt;FECHA-NAC-M/P-ESP</w:t>
+      </w:r>
+      <w:proofErr w:type="gramStart"/>
+      <w:r>
+        <w:rPr>
+          <w:sz w:val="20"/>
+        </w:rPr>
+        <w:t xml:space="preserve">&gt; </w:t>
+      </w:r>
+      <w:r>
+        <w:rPr>
+          <w:sz w:val="20"/>
+        </w:rPr>
+        <w:t xml:space="preserve"> de</w:t>
+      </w:r>
+      <w:proofErr w:type="gramEnd"/>
+      <w:r>
+        <w:rPr>
+          <w:sz w:val="20"/>
+        </w:rPr>
+        <w:t xml:space="preserve"> nacionalidad ESPAÑOLA, cuya identidad acredita </w:t>
+      </w:r>
+      <w:proofErr w:type="gramStart"/>
+      <w:r>
+        <w:rPr>
+          <w:sz w:val="20"/>
+        </w:rPr>
+        <w:t>por  DNI</w:t>
+      </w:r>
+      <w:proofErr w:type="gramEnd"/>
+      <w:r>
+        <w:rPr>
+          <w:sz w:val="20"/>
+        </w:rPr>
+        <w:t xml:space="preserve">, con domicilio en   </w:t>
       </w:r>
       <w:r>
         <w:rPr>
@@ -199,6 +270,7 @@
         </w:rPr>
         <w:t>DOMIC. INT</w:t>
       </w:r>
+      <w:proofErr w:type="gramStart"/>
       <w:r>
         <w:rPr>
           <w:sz w:val="20"/>
@@ -209,7 +281,14 @@
         <w:rPr>
           <w:sz w:val="20"/>
         </w:rPr>
-        <w:t xml:space="preserve">  MENDOZA -Argentina, en representación </w:t>
+        <w:t xml:space="preserve">  MENDOZA</w:t>
+      </w:r>
+      <w:proofErr w:type="gramEnd"/>
+      <w:r>
+        <w:rPr>
+          <w:sz w:val="20"/>
+        </w:rPr>
+        <w:t xml:space="preserve"> -Argentina, en representación </w:t>
       </w:r>
       <w:r>
         <w:rPr>
@@ -281,6 +360,7 @@
         </w:rPr>
         <w:t>FECHA NAC, INT</w:t>
       </w:r>
+      <w:proofErr w:type="gramStart"/>
       <w:r>
         <w:rPr>
           <w:sz w:val="20"/>
@@ -297,7 +377,14 @@
         <w:rPr>
           <w:sz w:val="20"/>
         </w:rPr>
-        <w:t xml:space="preserve"> &lt;NRO-DNI&gt;</w:t>
+        <w:t xml:space="preserve"> &lt;</w:t>
+      </w:r>
+      <w:proofErr w:type="gramEnd"/>
+      <w:r>
+        <w:rPr>
+          <w:sz w:val="20"/>
+        </w:rPr>
+        <w:t>NRO-DNI&gt;</w:t>
       </w:r>
       <w:r>
         <w:rPr>
@@ -527,6 +614,7 @@
         <w:pStyle w:val="Textoindependiente21"/>
         <w:spacing w:line="18pt" w:lineRule="exact"/>
       </w:pPr>
+      <w:proofErr w:type="gramStart"/>
       <w:r>
         <w:rPr>
           <w:sz w:val="20"/>
@@ -537,50 +625,57 @@
         <w:rPr>
           <w:sz w:val="20"/>
         </w:rPr>
-        <w:t>&lt;FECHAACTA&gt;</w:t>
-      </w:r>
-    </w:p>
-    <w:p>
-      <w:pPr>
-        <w:pStyle w:val="Textoindependiente21"/>
-        <w:spacing w:line="18pt" w:lineRule="exact"/>
-        <w:rPr>
-          <w:sz w:val="20"/>
-        </w:rPr>
-      </w:pPr>
-    </w:p>
-    <w:p>
-      <w:pPr>
-        <w:pStyle w:val="Textoindependiente21"/>
-        <w:spacing w:line="18pt" w:lineRule="exact"/>
-        <w:rPr>
-          <w:sz w:val="20"/>
-        </w:rPr>
-      </w:pPr>
-    </w:p>
-    <w:p>
-      <w:pPr>
-        <w:pStyle w:val="Textoindependiente21"/>
-        <w:spacing w:line="18pt" w:lineRule="exact"/>
-        <w:rPr>
-          <w:sz w:val="20"/>
-        </w:rPr>
-      </w:pPr>
-    </w:p>
-    <w:p>
-      <w:pPr>
-        <w:pStyle w:val="Textoindependiente21"/>
-        <w:spacing w:line="18pt" w:lineRule="exact"/>
-        <w:rPr>
-          <w:sz w:val="20"/>
-        </w:rPr>
-      </w:pPr>
-      <w:r>
-        <w:rPr>
-          <w:sz w:val="20"/>
-        </w:rPr>
         <w:t>&lt;</w:t>
       </w:r>
+      <w:proofErr w:type="gramEnd"/>
+      <w:r>
+        <w:rPr>
+          <w:sz w:val="20"/>
+        </w:rPr>
+        <w:t>FECHAACTA&gt;</w:t>
+      </w:r>
+    </w:p>
+    <w:p>
+      <w:pPr>
+        <w:pStyle w:val="Textoindependiente21"/>
+        <w:spacing w:line="18pt" w:lineRule="exact"/>
+        <w:rPr>
+          <w:sz w:val="20"/>
+        </w:rPr>
+      </w:pPr>
+    </w:p>
+    <w:p>
+      <w:pPr>
+        <w:pStyle w:val="Textoindependiente21"/>
+        <w:spacing w:line="18pt" w:lineRule="exact"/>
+        <w:rPr>
+          <w:sz w:val="20"/>
+        </w:rPr>
+      </w:pPr>
+    </w:p>
+    <w:p>
+      <w:pPr>
+        <w:pStyle w:val="Textoindependiente21"/>
+        <w:spacing w:line="18pt" w:lineRule="exact"/>
+        <w:rPr>
+          <w:sz w:val="20"/>
+        </w:rPr>
+      </w:pPr>
+    </w:p>
+    <w:p>
+      <w:pPr>
+        <w:pStyle w:val="Textoindependiente21"/>
+        <w:spacing w:line="18pt" w:lineRule="exact"/>
+        <w:rPr>
+          <w:sz w:val="20"/>
+        </w:rPr>
+      </w:pPr>
+      <w:r>
+        <w:rPr>
+          <w:sz w:val="20"/>
+        </w:rPr>
+        <w:t>&lt;</w:t>
+      </w:r>
       <w:r>
         <w:rPr>
           <w:sz w:val="20"/>
@@ -590,59 +685,37 @@
     </w:p>
     <w:p>
       <w:pPr>
-        <w:pStyle w:val="Textoindependiente21"/>
-        <w:spacing w:line="18pt" w:lineRule="exact"/>
-        <w:rPr>
-          <w:sz w:val="20"/>
-        </w:rPr>
-      </w:pPr>
-    </w:p>
-    <w:p>
-      <w:pPr>
-        <w:pStyle w:val="Textoindependiente21"/>
-        <w:spacing w:line="18pt" w:lineRule="exact"/>
-        <w:rPr>
-          <w:sz w:val="20"/>
-        </w:rPr>
-      </w:pPr>
-    </w:p>
-    <w:p>
-      <w:pPr>
-        <w:pStyle w:val="Textoindependiente21"/>
-        <w:spacing w:line="18pt" w:lineRule="exact"/>
-        <w:rPr>
-          <w:sz w:val="20"/>
-        </w:rPr>
-      </w:pPr>
-    </w:p>
-    <w:p>
-      <w:pPr>
-        <w:pStyle w:val="Textoindependiente21"/>
-        <w:spacing w:line="18pt" w:lineRule="exact"/>
-        <w:rPr>
-          <w:sz w:val="20"/>
-        </w:rPr>
-      </w:pPr>
-    </w:p>
-    <w:p>
-      <w:pPr>
-        <w:pStyle w:val="Textoindependiente21"/>
-        <w:spacing w:line="18pt" w:lineRule="exact"/>
-        <w:rPr>
-          <w:sz w:val="20"/>
-        </w:rPr>
-      </w:pPr>
-    </w:p>
-    <w:p>
-      <w:pPr>
-        <w:pStyle w:val="Textoindependiente21"/>
-        <w:spacing w:line="18pt" w:lineRule="exact"/>
-      </w:pPr>
-      <w:r>
-        <w:rPr>
-          <w:sz w:val="20"/>
-        </w:rPr>
-        <w:lastRenderedPageBreak/>
+        <w:suppressAutoHyphens w:val="0"/>
+        <w:rPr>
+          <w:rFonts w:ascii="Arial" w:hAnsi="Arial" w:cs="Arial"/>
+          <w:sz w:val="20"/>
+        </w:rPr>
+      </w:pPr>
+      <w:r>
+        <w:rPr>
+          <w:sz w:val="20"/>
+        </w:rPr>
+        <w:br w:type="page"/>
+      </w:r>
+    </w:p>
+    <w:p>
+      <w:pPr>
+        <w:pStyle w:val="Textoindependiente21"/>
+        <w:spacing w:line="18pt" w:lineRule="exact"/>
+        <w:rPr>
+          <w:sz w:val="20"/>
+        </w:rPr>
+      </w:pPr>
+    </w:p>
+    <w:p>
+      <w:pPr>
+        <w:pStyle w:val="Textoindependiente21"/>
+        <w:spacing w:line="18pt" w:lineRule="exact"/>
+      </w:pPr>
+      <w:r>
+        <w:rPr>
+          <w:sz w:val="20"/>
+        </w:rPr>
         <w:t>INFORME FISCAL: el fiscal que suscribe, visto el presente, estima que han quedado suficientemente acreditados los extremos contemplados en el art. 20.2 del C.c. por lo que no se opone y presta conformidad al pedido de opción solicitado.</w:t>
       </w:r>
     </w:p>
@@ -651,6 +724,7 @@
         <w:pStyle w:val="Textoindependiente21"/>
         <w:spacing w:line="18pt" w:lineRule="exact"/>
       </w:pPr>
+      <w:proofErr w:type="gramStart"/>
       <w:r>
         <w:rPr>
           <w:sz w:val="20"/>
@@ -661,7 +735,14 @@
         <w:rPr>
           <w:sz w:val="20"/>
         </w:rPr>
-        <w:t>&lt;FECHAACTA&gt;</w:t>
+        <w:t>&lt;</w:t>
+      </w:r>
+      <w:proofErr w:type="gramEnd"/>
+      <w:r>
+        <w:rPr>
+          <w:sz w:val="20"/>
+        </w:rPr>
+        <w:t>FECHAACTA&gt;</w:t>
       </w:r>
     </w:p>
     <w:p>
@@ -766,6 +847,7 @@
         <w:pStyle w:val="Textoindependiente21"/>
         <w:spacing w:line="18pt" w:lineRule="exact"/>
       </w:pPr>
+      <w:proofErr w:type="gramStart"/>
       <w:r>
         <w:rPr>
           <w:sz w:val="20"/>
@@ -776,7 +858,14 @@
         <w:rPr>
           <w:sz w:val="20"/>
         </w:rPr>
-        <w:t>&lt;FECHAACTA&gt;</w:t>
+        <w:t>&lt;</w:t>
+      </w:r>
+      <w:proofErr w:type="gramEnd"/>
+      <w:r>
+        <w:rPr>
+          <w:sz w:val="20"/>
+        </w:rPr>
+        <w:t>FECHAACTA&gt;</w:t>
       </w:r>
     </w:p>
     <w:p>
@@ -859,6 +948,7 @@
         </w:rPr>
         <w:t>-ESP</w:t>
       </w:r>
+      <w:proofErr w:type="gramStart"/>
       <w:r>
         <w:rPr>
           <w:sz w:val="20"/>
@@ -869,14 +959,50 @@
         <w:rPr>
           <w:sz w:val="20"/>
         </w:rPr>
-        <w:t>,  dado los requisitos establecidos en el art. 20.2 a del C.c. declara su voluntad de optar por la nacionalidad española en nombre de su representado/a y por la vecindad civil COMUN,  (art. 15 C.c.) no renunciando a la nacionalidad  argentina en virtud del art. 23.b y 24.2 del C.c.</w:t>
-      </w:r>
-    </w:p>
-    <w:p>
-      <w:pPr>
-        <w:pStyle w:val="Textoindependiente21"/>
-        <w:spacing w:line="18pt" w:lineRule="exact"/>
-      </w:pPr>
+        <w:t>,  dado</w:t>
+      </w:r>
+      <w:proofErr w:type="gramEnd"/>
+      <w:r>
+        <w:rPr>
+          <w:sz w:val="20"/>
+        </w:rPr>
+        <w:t xml:space="preserve"> los requisitos establecidos en el art. 20.2 a del C.c. declara su voluntad de optar por la nacionalidad española en nombre de su representado/a y por la vecindad civil </w:t>
+      </w:r>
+      <w:proofErr w:type="gramStart"/>
+      <w:r>
+        <w:rPr>
+          <w:sz w:val="20"/>
+        </w:rPr>
+        <w:t>COMUN,  (</w:t>
+      </w:r>
+      <w:proofErr w:type="gramEnd"/>
+      <w:r>
+        <w:rPr>
+          <w:sz w:val="20"/>
+        </w:rPr>
+        <w:t xml:space="preserve">art. 15 C.c.) no renunciando a la </w:t>
+      </w:r>
+      <w:proofErr w:type="gramStart"/>
+      <w:r>
+        <w:rPr>
+          <w:sz w:val="20"/>
+        </w:rPr>
+        <w:t>nacionalidad  argentina</w:t>
+      </w:r>
+      <w:proofErr w:type="gramEnd"/>
+      <w:r>
+        <w:rPr>
+          <w:sz w:val="20"/>
+        </w:rPr>
+        <w:t xml:space="preserve"> en virtud del art. 23.b y 24.2 del C.c.</w:t>
+      </w:r>
+    </w:p>
+    <w:p>
+      <w:pPr>
+        <w:pStyle w:val="Textoindependiente21"/>
+        <w:spacing w:line="18pt" w:lineRule="exact"/>
+      </w:pPr>
+      <w:proofErr w:type="gramStart"/>
       <w:r>
         <w:rPr>
           <w:sz w:val="20"/>
@@ -887,7 +1013,14 @@
         <w:rPr>
           <w:sz w:val="20"/>
         </w:rPr>
-        <w:t>&lt;FECHAACTA&gt;</w:t>
+        <w:t>&lt;</w:t>
+      </w:r>
+      <w:proofErr w:type="gramEnd"/>
+      <w:r>
+        <w:rPr>
+          <w:sz w:val="20"/>
+        </w:rPr>
+        <w:t>FECHAACTA&gt;</w:t>
       </w:r>
     </w:p>
     <w:p>
@@ -1015,7 +1148,21 @@
       <w:rPr>
         <w:sz w:val="15"/>
       </w:rPr>
-      <w:t>Opción MENOR  14 años 2024  LUCIA  ADRIANA PARRA VARGAS.doc</w:t>
+      <w:t xml:space="preserve">Opción MENOR  14 años </w:t>
+    </w:r>
+    <w:proofErr w:type="gramStart"/>
+    <w:r>
+      <w:rPr>
+        <w:sz w:val="15"/>
+      </w:rPr>
+      <w:t>2024  LUCIA</w:t>
+    </w:r>
+    <w:proofErr w:type="gramEnd"/>
+    <w:r>
+      <w:rPr>
+        <w:sz w:val="15"/>
+      </w:rPr>
+      <w:t xml:space="preserve">  ADRIANA PARRA VARGAS.doc</w:t>
     </w:r>
     <w:r>
       <w:rPr>

</xml_diff>